<commit_message>
Auto-save: 31 file(s) — 2026-08-25 18:19
</commit_message>
<xml_diff>
--- a/Projects/NEPRA Follow-Up Letters/04_Aritistic_Energy.docx
+++ b/Projects/NEPRA Follow-Up Letters/04_Aritistic_Energy.docx
@@ -468,16 +468,6 @@
         </w:rPr>
         <w:t>Warm regards,</w:t>
       </w:r>
-    </w:p>
-    <w:p>
-      <w:pPr>
-        <w:spacing w:after="40"/>
-        <w:rPr>
-          <w:rFonts w:ascii="Poppins" w:hAnsi="Poppins" w:cs="Poppins"/>
-          <w:sz w:val="19"/>
-          <w:szCs w:val="19"/>
-        </w:rPr>
-      </w:pPr>
     </w:p>
     <w:p>
       <w:pPr>
@@ -575,6 +565,14 @@
     <w:p>
       <w:pPr>
         <w:rPr>
+          <w:rFonts w:ascii="Poppins" w:hAnsi="Poppins" w:cs="Poppins"/>
+          <w:b/>
+          <w:sz w:val="19"/>
+          <w:szCs w:val="19"/>
+        </w:rPr>
+      </w:pPr>
+      <w:r>
+        <w:rPr>
           <w:rFonts w:ascii="Poppins" w:eastAsia="Calibri" w:hAnsi="Poppins" w:cs="Poppins"/>
           <w:b/>
           <w:bCs/>
@@ -582,26 +580,6 @@
           <w:sz w:val="19"/>
           <w:szCs w:val="19"/>
         </w:rPr>
-      </w:pPr>
-    </w:p>
-    <w:p>
-      <w:pPr>
-        <w:rPr>
-          <w:rFonts w:ascii="Poppins" w:hAnsi="Poppins" w:cs="Poppins"/>
-          <w:b/>
-          <w:sz w:val="19"/>
-          <w:szCs w:val="19"/>
-        </w:rPr>
-      </w:pPr>
-      <w:r>
-        <w:rPr>
-          <w:rFonts w:ascii="Poppins" w:eastAsia="Calibri" w:hAnsi="Poppins" w:cs="Poppins"/>
-          <w:b/>
-          <w:bCs/>
-          <w:color w:val="0B2545"/>
-          <w:sz w:val="19"/>
-          <w:szCs w:val="19"/>
-        </w:rPr>
         <w:t>Huzaifa Valika</w:t>
       </w:r>
     </w:p>
@@ -660,7 +638,6 @@
           <w:sz w:val="19"/>
           <w:szCs w:val="19"/>
         </w:rPr>
-        <w:lastRenderedPageBreak/>
         <w:t>Phone: 0322-2009713</w:t>
       </w:r>
     </w:p>
@@ -674,10 +651,14 @@
       </w:pPr>
     </w:p>
     <w:sectPr>
-      <w:headerReference w:type="default" r:id="rId8"/>
-      <w:footerReference w:type="default" r:id="rId9"/>
-      <w:pgSz w:w="12240" w:h="15840"/>
-      <w:pgMar w:top="2160" w:right="1100" w:bottom="900" w:left="1100" w:header="708" w:footer="708" w:gutter="0"/>
+      <w:headerReference w:type="even" r:id="rId8"/>
+      <w:headerReference w:type="default" r:id="rId9"/>
+      <w:footerReference w:type="even" r:id="rId10"/>
+      <w:footerReference w:type="default" r:id="rId11"/>
+      <w:headerReference w:type="first" r:id="rId12"/>
+      <w:footerReference w:type="first" r:id="rId13"/>
+      <w:pgSz w:w="11906" w:h="16838"/>
+      <w:pgMar w:top="2211" w:right="1100" w:bottom="1984" w:left="1100" w:header="0" w:footer="0" w:gutter="0"/>
       <w:cols w:space="720"/>
       <w:docGrid w:linePitch="360"/>
     </w:sectPr>
@@ -708,10 +689,27 @@
 <w:ftr xmlns:wpc="http://schemas.microsoft.com/office/word/2010/wordprocessingCanvas" xmlns:cx="http://schemas.microsoft.com/office/drawing/2014/chartex" xmlns:cx1="http://schemas.microsoft.com/office/drawing/2015/9/8/chartex" xmlns:cx2="http://schemas.microsoft.com/office/drawing/2015/10/21/chartex" xmlns:cx3="http://schemas.microsoft.com/office/drawing/2016/5/9/chartex" xmlns:cx4="http://schemas.microsoft.com/office/drawing/2016/5/10/chartex" xmlns:cx5="http://schemas.microsoft.com/office/drawing/2016/5/11/chartex" xmlns:cx6="http://schemas.microsoft.com/office/drawing/2016/5/12/chartex" xmlns:cx7="http://schemas.microsoft.com/office/drawing/2016/5/13/chartex" xmlns:cx8="http://schemas.microsoft.com/office/drawing/2016/5/14/chartex" xmlns:mc="http://schemas.openxmlformats.org/markup-compatibility/2006" xmlns:aink="http://schemas.microsoft.com/office/drawing/2016/ink" xmlns:am3d="http://schemas.microsoft.com/office/drawing/2017/model3d" xmlns:o="urn:schemas-microsoft-com:office:office" xmlns:r="http://schemas.openxmlformats.org/officeDocument/2006/relationships" xmlns:m="http://schemas.openxmlformats.org/officeDocument/2006/math" xmlns:v="urn:schemas-microsoft-com:vml" xmlns:wp14="http://schemas.microsoft.com/office/word/2010/wordprocessingDrawing" xmlns:wp="http://schemas.openxmlformats.org/drawingml/2006/wordprocessingDrawing" xmlns:w10="urn:schemas-microsoft-com:office:word" xmlns:w="http://schemas.openxmlformats.org/wordprocessingml/2006/main" xmlns:w14="http://schemas.microsoft.com/office/word/2010/wordml" xmlns:w15="http://schemas.microsoft.com/office/word/2012/wordml" xmlns:w16cid="http://schemas.microsoft.com/office/word/2016/wordml/cid" xmlns:w16se="http://schemas.microsoft.com/office/word/2015/wordml/symex" xmlns:wpg="http://schemas.microsoft.com/office/word/2010/wordprocessingGroup" xmlns:wpi="http://schemas.microsoft.com/office/word/2010/wordprocessingInk" xmlns:wne="http://schemas.microsoft.com/office/word/2006/wordml" xmlns:wps="http://schemas.microsoft.com/office/word/2010/wordprocessingShape" mc:Ignorable="w14 w15 w16se w16cid wp14">
   <w:p>
     <w:pPr>
-      <w:pBdr>
-        <w:top w:val="single" w:sz="6" w:space="6" w:color="CCCCCC"/>
-      </w:pBdr>
+      <w:pStyle w:val="Footer"/>
+    </w:pPr>
+  </w:p>
+</w:ftr>
+</file>
+
+<file path=word/footer2.xml><?xml version="1.0" encoding="utf-8"?>
+<w:ftr xmlns:wpc="http://schemas.microsoft.com/office/word/2010/wordprocessingCanvas" xmlns:cx="http://schemas.microsoft.com/office/drawing/2014/chartex" xmlns:cx1="http://schemas.microsoft.com/office/drawing/2015/9/8/chartex" xmlns:cx2="http://schemas.microsoft.com/office/drawing/2015/10/21/chartex" xmlns:cx3="http://schemas.microsoft.com/office/drawing/2016/5/9/chartex" xmlns:cx4="http://schemas.microsoft.com/office/drawing/2016/5/10/chartex" xmlns:cx5="http://schemas.microsoft.com/office/drawing/2016/5/11/chartex" xmlns:cx6="http://schemas.microsoft.com/office/drawing/2016/5/12/chartex" xmlns:cx7="http://schemas.microsoft.com/office/drawing/2016/5/13/chartex" xmlns:cx8="http://schemas.microsoft.com/office/drawing/2016/5/14/chartex" xmlns:mc="http://schemas.openxmlformats.org/markup-compatibility/2006" xmlns:aink="http://schemas.microsoft.com/office/drawing/2016/ink" xmlns:am3d="http://schemas.microsoft.com/office/drawing/2017/model3d" xmlns:o="urn:schemas-microsoft-com:office:office" xmlns:r="http://schemas.openxmlformats.org/officeDocument/2006/relationships" xmlns:m="http://schemas.openxmlformats.org/officeDocument/2006/math" xmlns:v="urn:schemas-microsoft-com:vml" xmlns:wp14="http://schemas.microsoft.com/office/word/2010/wordprocessingDrawing" xmlns:wp="http://schemas.openxmlformats.org/drawingml/2006/wordprocessingDrawing" xmlns:w10="urn:schemas-microsoft-com:office:word" xmlns:w="http://schemas.openxmlformats.org/wordprocessingml/2006/main" xmlns:w14="http://schemas.microsoft.com/office/word/2010/wordml" xmlns:w15="http://schemas.microsoft.com/office/word/2012/wordml" xmlns:w16cid="http://schemas.microsoft.com/office/word/2016/wordml/cid" xmlns:w16se="http://schemas.microsoft.com/office/word/2015/wordml/symex" xmlns:wpg="http://schemas.microsoft.com/office/word/2010/wordprocessingGroup" xmlns:wpi="http://schemas.microsoft.com/office/word/2010/wordprocessingInk" xmlns:wne="http://schemas.microsoft.com/office/word/2006/wordml" xmlns:wps="http://schemas.microsoft.com/office/word/2010/wordprocessingShape" mc:Ignorable="w14 w15 w16se w16cid wp14">
+  <w:p>
+    <w:pPr>
       <w:jc w:val="center"/>
+    </w:pPr>
+  </w:p>
+</w:ftr>
+</file>
+
+<file path=word/footer3.xml><?xml version="1.0" encoding="utf-8"?>
+<w:ftr xmlns:wpc="http://schemas.microsoft.com/office/word/2010/wordprocessingCanvas" xmlns:cx="http://schemas.microsoft.com/office/drawing/2014/chartex" xmlns:cx1="http://schemas.microsoft.com/office/drawing/2015/9/8/chartex" xmlns:cx2="http://schemas.microsoft.com/office/drawing/2015/10/21/chartex" xmlns:cx3="http://schemas.microsoft.com/office/drawing/2016/5/9/chartex" xmlns:cx4="http://schemas.microsoft.com/office/drawing/2016/5/10/chartex" xmlns:cx5="http://schemas.microsoft.com/office/drawing/2016/5/11/chartex" xmlns:cx6="http://schemas.microsoft.com/office/drawing/2016/5/12/chartex" xmlns:cx7="http://schemas.microsoft.com/office/drawing/2016/5/13/chartex" xmlns:cx8="http://schemas.microsoft.com/office/drawing/2016/5/14/chartex" xmlns:mc="http://schemas.openxmlformats.org/markup-compatibility/2006" xmlns:aink="http://schemas.microsoft.com/office/drawing/2016/ink" xmlns:am3d="http://schemas.microsoft.com/office/drawing/2017/model3d" xmlns:o="urn:schemas-microsoft-com:office:office" xmlns:r="http://schemas.openxmlformats.org/officeDocument/2006/relationships" xmlns:m="http://schemas.openxmlformats.org/officeDocument/2006/math" xmlns:v="urn:schemas-microsoft-com:vml" xmlns:wp14="http://schemas.microsoft.com/office/word/2010/wordprocessingDrawing" xmlns:wp="http://schemas.openxmlformats.org/drawingml/2006/wordprocessingDrawing" xmlns:w10="urn:schemas-microsoft-com:office:word" xmlns:w="http://schemas.openxmlformats.org/wordprocessingml/2006/main" xmlns:w14="http://schemas.microsoft.com/office/word/2010/wordml" xmlns:w15="http://schemas.microsoft.com/office/word/2012/wordml" xmlns:w16cid="http://schemas.microsoft.com/office/word/2016/wordml/cid" xmlns:w16se="http://schemas.microsoft.com/office/word/2015/wordml/symex" xmlns:wpg="http://schemas.microsoft.com/office/word/2010/wordprocessingGroup" xmlns:wpi="http://schemas.microsoft.com/office/word/2010/wordprocessingInk" xmlns:wne="http://schemas.microsoft.com/office/word/2006/wordml" xmlns:wps="http://schemas.microsoft.com/office/word/2010/wordprocessingShape" mc:Ignorable="w14 w15 w16se w16cid wp14">
+  <w:p>
+    <w:pPr>
+      <w:pStyle w:val="Footer"/>
     </w:pPr>
   </w:p>
 </w:ftr>
@@ -740,7 +738,87 @@
 <w:hdr xmlns:wpc="http://schemas.microsoft.com/office/word/2010/wordprocessingCanvas" xmlns:cx="http://schemas.microsoft.com/office/drawing/2014/chartex" xmlns:cx1="http://schemas.microsoft.com/office/drawing/2015/9/8/chartex" xmlns:cx2="http://schemas.microsoft.com/office/drawing/2015/10/21/chartex" xmlns:cx3="http://schemas.microsoft.com/office/drawing/2016/5/9/chartex" xmlns:cx4="http://schemas.microsoft.com/office/drawing/2016/5/10/chartex" xmlns:cx5="http://schemas.microsoft.com/office/drawing/2016/5/11/chartex" xmlns:cx6="http://schemas.microsoft.com/office/drawing/2016/5/12/chartex" xmlns:cx7="http://schemas.microsoft.com/office/drawing/2016/5/13/chartex" xmlns:cx8="http://schemas.microsoft.com/office/drawing/2016/5/14/chartex" xmlns:mc="http://schemas.openxmlformats.org/markup-compatibility/2006" xmlns:aink="http://schemas.microsoft.com/office/drawing/2016/ink" xmlns:am3d="http://schemas.microsoft.com/office/drawing/2017/model3d" xmlns:o="urn:schemas-microsoft-com:office:office" xmlns:r="http://schemas.openxmlformats.org/officeDocument/2006/relationships" xmlns:m="http://schemas.openxmlformats.org/officeDocument/2006/math" xmlns:v="urn:schemas-microsoft-com:vml" xmlns:wp14="http://schemas.microsoft.com/office/word/2010/wordprocessingDrawing" xmlns:wp="http://schemas.openxmlformats.org/drawingml/2006/wordprocessingDrawing" xmlns:w10="urn:schemas-microsoft-com:office:word" xmlns:w="http://schemas.openxmlformats.org/wordprocessingml/2006/main" xmlns:w14="http://schemas.microsoft.com/office/word/2010/wordml" xmlns:w15="http://schemas.microsoft.com/office/word/2012/wordml" xmlns:w16cid="http://schemas.microsoft.com/office/word/2016/wordml/cid" xmlns:w16se="http://schemas.microsoft.com/office/word/2015/wordml/symex" xmlns:wpg="http://schemas.microsoft.com/office/word/2010/wordprocessingGroup" xmlns:wpi="http://schemas.microsoft.com/office/word/2010/wordprocessingInk" xmlns:wne="http://schemas.microsoft.com/office/word/2006/wordml" xmlns:wps="http://schemas.microsoft.com/office/word/2010/wordprocessingShape" mc:Ignorable="w14 w15 w16se w16cid wp14">
   <w:p>
     <w:pPr>
+      <w:pStyle w:val="Header"/>
+    </w:pPr>
+  </w:p>
+</w:hdr>
+</file>
+
+<file path=word/header2.xml><?xml version="1.0" encoding="utf-8"?>
+<w:hdr xmlns:wpc="http://schemas.microsoft.com/office/word/2010/wordprocessingCanvas" xmlns:cx="http://schemas.microsoft.com/office/drawing/2014/chartex" xmlns:cx1="http://schemas.microsoft.com/office/drawing/2015/9/8/chartex" xmlns:cx2="http://schemas.microsoft.com/office/drawing/2015/10/21/chartex" xmlns:cx3="http://schemas.microsoft.com/office/drawing/2016/5/9/chartex" xmlns:cx4="http://schemas.microsoft.com/office/drawing/2016/5/10/chartex" xmlns:cx5="http://schemas.microsoft.com/office/drawing/2016/5/11/chartex" xmlns:cx6="http://schemas.microsoft.com/office/drawing/2016/5/12/chartex" xmlns:cx7="http://schemas.microsoft.com/office/drawing/2016/5/13/chartex" xmlns:cx8="http://schemas.microsoft.com/office/drawing/2016/5/14/chartex" xmlns:mc="http://schemas.openxmlformats.org/markup-compatibility/2006" xmlns:aink="http://schemas.microsoft.com/office/drawing/2016/ink" xmlns:am3d="http://schemas.microsoft.com/office/drawing/2017/model3d" xmlns:o="urn:schemas-microsoft-com:office:office" xmlns:r="http://schemas.openxmlformats.org/officeDocument/2006/relationships" xmlns:m="http://schemas.openxmlformats.org/officeDocument/2006/math" xmlns:v="urn:schemas-microsoft-com:vml" xmlns:wp14="http://schemas.microsoft.com/office/word/2010/wordprocessingDrawing" xmlns:wp="http://schemas.openxmlformats.org/drawingml/2006/wordprocessingDrawing" xmlns:w10="urn:schemas-microsoft-com:office:word" xmlns:w="http://schemas.openxmlformats.org/wordprocessingml/2006/main" xmlns:w14="http://schemas.microsoft.com/office/word/2010/wordml" xmlns:w15="http://schemas.microsoft.com/office/word/2012/wordml" xmlns:w16cid="http://schemas.microsoft.com/office/word/2016/wordml/cid" xmlns:w16se="http://schemas.microsoft.com/office/word/2015/wordml/symex" xmlns:wpg="http://schemas.microsoft.com/office/word/2010/wordprocessingGroup" xmlns:wpi="http://schemas.microsoft.com/office/word/2010/wordprocessingInk" xmlns:wne="http://schemas.microsoft.com/office/word/2006/wordml" xmlns:wps="http://schemas.microsoft.com/office/word/2010/wordprocessingShape" mc:Ignorable="w14 w15 w16se w16cid wp14">
+  <w:p>
+    <w:pPr>
       <w:spacing w:after="200"/>
+    </w:pPr>
+    <w:r>
+      <w:rPr>
+        <w:noProof/>
+      </w:rPr>
+      <w:drawing>
+        <wp:anchor distT="0" distB="0" distL="114300" distR="114300" simplePos="0" relativeHeight="251658240" behindDoc="1" locked="0" layoutInCell="1" allowOverlap="1" wp14:anchorId="5D26268E" wp14:editId="0799FF55">
+          <wp:simplePos x="0" y="0"/>
+          <wp:positionH relativeFrom="page">
+            <wp:posOffset>0</wp:posOffset>
+          </wp:positionH>
+          <wp:positionV relativeFrom="page">
+            <wp:posOffset>0</wp:posOffset>
+          </wp:positionV>
+          <wp:extent cx="7560000" cy="10692000"/>
+          <wp:effectExtent l="0" t="0" r="3175" b="0"/>
+          <wp:wrapNone/>
+          <wp:docPr id="2" name="LetterheadArt"/>
+          <wp:cNvGraphicFramePr>
+            <a:graphicFrameLocks xmlns:a="http://schemas.openxmlformats.org/drawingml/2006/main"/>
+          </wp:cNvGraphicFramePr>
+          <a:graphic xmlns:a="http://schemas.openxmlformats.org/drawingml/2006/main">
+            <a:graphicData uri="http://schemas.openxmlformats.org/drawingml/2006/picture">
+              <pic:pic xmlns:pic="http://schemas.openxmlformats.org/drawingml/2006/picture">
+                <pic:nvPicPr>
+                  <pic:cNvPr id="2" name=""/>
+                  <pic:cNvPicPr/>
+                </pic:nvPicPr>
+                <pic:blipFill>
+                  <a:blip r:embed="rId1">
+                    <a:extLst>
+                      <a:ext uri="{28A0092B-C50C-407E-A947-70E740481C1C}">
+                        <a14:useLocalDpi xmlns:a14="http://schemas.microsoft.com/office/drawing/2010/main" val="0"/>
+                      </a:ext>
+                    </a:extLst>
+                  </a:blip>
+                  <a:stretch>
+                    <a:fillRect/>
+                  </a:stretch>
+                </pic:blipFill>
+                <pic:spPr>
+                  <a:xfrm>
+                    <a:off x="0" y="0"/>
+                    <a:ext cx="7560000" cy="10692000"/>
+                  </a:xfrm>
+                  <a:prstGeom prst="rect">
+                    <a:avLst/>
+                  </a:prstGeom>
+                </pic:spPr>
+              </pic:pic>
+            </a:graphicData>
+          </a:graphic>
+          <wp14:sizeRelH relativeFrom="margin">
+            <wp14:pctWidth>0</wp14:pctWidth>
+          </wp14:sizeRelH>
+          <wp14:sizeRelV relativeFrom="margin">
+            <wp14:pctHeight>0</wp14:pctHeight>
+          </wp14:sizeRelV>
+        </wp:anchor>
+      </w:drawing>
+    </w:r>
+  </w:p>
+</w:hdr>
+</file>
+
+<file path=word/header3.xml><?xml version="1.0" encoding="utf-8"?>
+<w:hdr xmlns:wpc="http://schemas.microsoft.com/office/word/2010/wordprocessingCanvas" xmlns:cx="http://schemas.microsoft.com/office/drawing/2014/chartex" xmlns:cx1="http://schemas.microsoft.com/office/drawing/2015/9/8/chartex" xmlns:cx2="http://schemas.microsoft.com/office/drawing/2015/10/21/chartex" xmlns:cx3="http://schemas.microsoft.com/office/drawing/2016/5/9/chartex" xmlns:cx4="http://schemas.microsoft.com/office/drawing/2016/5/10/chartex" xmlns:cx5="http://schemas.microsoft.com/office/drawing/2016/5/11/chartex" xmlns:cx6="http://schemas.microsoft.com/office/drawing/2016/5/12/chartex" xmlns:cx7="http://schemas.microsoft.com/office/drawing/2016/5/13/chartex" xmlns:cx8="http://schemas.microsoft.com/office/drawing/2016/5/14/chartex" xmlns:mc="http://schemas.openxmlformats.org/markup-compatibility/2006" xmlns:aink="http://schemas.microsoft.com/office/drawing/2016/ink" xmlns:am3d="http://schemas.microsoft.com/office/drawing/2017/model3d" xmlns:o="urn:schemas-microsoft-com:office:office" xmlns:r="http://schemas.openxmlformats.org/officeDocument/2006/relationships" xmlns:m="http://schemas.openxmlformats.org/officeDocument/2006/math" xmlns:v="urn:schemas-microsoft-com:vml" xmlns:wp14="http://schemas.microsoft.com/office/word/2010/wordprocessingDrawing" xmlns:wp="http://schemas.openxmlformats.org/drawingml/2006/wordprocessingDrawing" xmlns:w10="urn:schemas-microsoft-com:office:word" xmlns:w="http://schemas.openxmlformats.org/wordprocessingml/2006/main" xmlns:w14="http://schemas.microsoft.com/office/word/2010/wordml" xmlns:w15="http://schemas.microsoft.com/office/word/2012/wordml" xmlns:w16cid="http://schemas.microsoft.com/office/word/2016/wordml/cid" xmlns:w16se="http://schemas.microsoft.com/office/word/2015/wordml/symex" xmlns:wpg="http://schemas.microsoft.com/office/word/2010/wordprocessingGroup" xmlns:wpi="http://schemas.microsoft.com/office/word/2010/wordprocessingInk" xmlns:wne="http://schemas.microsoft.com/office/word/2006/wordml" xmlns:wps="http://schemas.microsoft.com/office/word/2010/wordprocessingShape" mc:Ignorable="w14 w15 w16se w16cid wp14">
+  <w:p>
+    <w:pPr>
+      <w:pStyle w:val="Header"/>
     </w:pPr>
   </w:p>
 </w:hdr>

</xml_diff>